<commit_message>
Update report, add first version of the presentation.
</commit_message>
<xml_diff>
--- a/CSCI323_Report_8848580.docx
+++ b/CSCI323_Report_8848580.docx
@@ -25662,7 +25662,21 @@
           <w:sz w:val="20"/>
           <w:szCs w:val="20"/>
         </w:rPr>
-        <w:t>Commercial real estate:</w:t>
+        <w:t>Commercial real estate</w:t>
+      </w:r>
+      <w:r>
+        <w:rPr>
+          <w:sz w:val="20"/>
+          <w:szCs w:val="20"/>
+        </w:rPr>
+        <w:t>/rental price prediction</w:t>
+      </w:r>
+      <w:r>
+        <w:rPr>
+          <w:sz w:val="20"/>
+          <w:szCs w:val="20"/>
+        </w:rPr>
+        <w:t>:</w:t>
       </w:r>
     </w:p>
     <w:p>
@@ -25682,7 +25696,21 @@
           <w:sz w:val="20"/>
           <w:szCs w:val="20"/>
         </w:rPr>
-        <w:t>With appropriate adaptations (office space features, retail unit specifications), the same gradient boosting approach is applicable to commercial property valuation.</w:t>
+        <w:t>With appropriate adaptations (office space features, retail unit specifications), the same gradient boosting approach is applicable to commercial property valuation</w:t>
+      </w:r>
+      <w:r>
+        <w:rPr>
+          <w:sz w:val="20"/>
+          <w:szCs w:val="20"/>
+        </w:rPr>
+        <w:t xml:space="preserve"> or for rental price predictions</w:t>
+      </w:r>
+      <w:r>
+        <w:rPr>
+          <w:sz w:val="20"/>
+          <w:szCs w:val="20"/>
+        </w:rPr>
+        <w:t>.</w:t>
       </w:r>
     </w:p>
     <w:p>
@@ -26812,6 +26840,7 @@
       </w:pPr>
       <w:r>
         <w:rPr>
+          <w:noProof/>
           <w:sz w:val="20"/>
           <w:szCs w:val="20"/>
         </w:rPr>

</xml_diff>